<commit_message>
Fix report as per Dor comments
</commit_message>
<xml_diff>
--- a/app/docx_templates/menora_photos.docx
+++ b/app/docx_templates/menora_photos.docx
@@ -33,18 +33,33 @@
         <w:t xml:space="preserve">                  </w:t>
       </w:r>
       <w:bookmarkStart w:id="0" w:name="_Hlk214468209"/>
-      <w:r>
-        <w:rPr>
-          <w:rFonts w:ascii="Arial" w:eastAsia="Times New Roman" w:hAnsi="Arial" w:cs="Arial"/>
-          <w:b/>
-          <w:bCs/>
-          <w:kern w:val="0"/>
-          <w:sz w:val="26"/>
-          <w:szCs w:val="26"/>
-          <w:lang w:eastAsia="he-IL" w:bidi="he-IL"/>
-          <w14:ligatures w14:val="none"/>
-        </w:rPr>
-        <w:t>{{ now }}</w:t>
+      <w:proofErr w:type="gramStart"/>
+      <w:r>
+        <w:rPr>
+          <w:rFonts w:ascii="Arial" w:eastAsia="Times New Roman" w:hAnsi="Arial" w:cs="Arial"/>
+          <w:b/>
+          <w:bCs/>
+          <w:kern w:val="0"/>
+          <w:sz w:val="26"/>
+          <w:szCs w:val="26"/>
+          <w:lang w:eastAsia="he-IL" w:bidi="he-IL"/>
+          <w14:ligatures w14:val="none"/>
+        </w:rPr>
+        <w:t>{{ now</w:t>
+      </w:r>
+      <w:proofErr w:type="gramEnd"/>
+      <w:r>
+        <w:rPr>
+          <w:rFonts w:ascii="Arial" w:eastAsia="Times New Roman" w:hAnsi="Arial" w:cs="Arial"/>
+          <w:b/>
+          <w:bCs/>
+          <w:kern w:val="0"/>
+          <w:sz w:val="26"/>
+          <w:szCs w:val="26"/>
+          <w:lang w:eastAsia="he-IL" w:bidi="he-IL"/>
+          <w14:ligatures w14:val="none"/>
+        </w:rPr>
+        <w:t xml:space="preserve"> }}</w:t>
       </w:r>
     </w:p>
     <w:p>
@@ -1299,6 +1314,14 @@
         <w:jc w:val="center"/>
         <w:rPr>
           <w:rFonts w:ascii="Arial" w:hAnsi="Arial" w:cs="Arial"/>
+          <w:sz w:val="26"/>
+          <w:szCs w:val="26"/>
+          <w:lang w:bidi="he-IL"/>
+        </w:rPr>
+      </w:pPr>
+      <w:r>
+        <w:rPr>
+          <w:rFonts w:ascii="Arial" w:hAnsi="Arial" w:cs="Arial"/>
           <w:b/>
           <w:bCs/>
           <w:sz w:val="26"/>
@@ -1306,27 +1329,13 @@
           <w:u w:val="single"/>
           <w:lang w:bidi="he-IL"/>
         </w:rPr>
-      </w:pPr>
-      <w:r>
-        <w:rPr>
-          <w:rFonts w:ascii="Arial" w:hAnsi="Arial" w:cs="Arial"/>
-          <w:b/>
-          <w:bCs/>
-          <w:sz w:val="26"/>
-          <w:szCs w:val="26"/>
-          <w:u w:val="single"/>
-          <w:lang w:bidi="he-IL"/>
-        </w:rPr>
         <w:br/>
       </w:r>
       <w:r>
         <w:rPr>
           <w:rFonts w:ascii="Arial" w:hAnsi="Arial" w:cs="Arial"/>
-          <w:b/>
-          <w:bCs/>
-          <w:sz w:val="26"/>
-          <w:szCs w:val="26"/>
-          <w:u w:val="single"/>
+          <w:sz w:val="26"/>
+          <w:szCs w:val="26"/>
           <w:rtl/>
           <w:lang w:bidi="he-IL"/>
         </w:rPr>
@@ -1335,11 +1344,8 @@
       <w:r>
         <w:rPr>
           <w:rFonts w:ascii="Arial" w:hAnsi="Arial" w:cs="Arial"/>
-          <w:b/>
-          <w:bCs/>
-          <w:sz w:val="26"/>
-          <w:szCs w:val="26"/>
-          <w:u w:val="single"/>
+          <w:sz w:val="26"/>
+          <w:szCs w:val="26"/>
           <w:lang w:bidi="he-IL"/>
         </w:rPr>
         <w:t xml:space="preserve">for page in </w:t>
@@ -1348,11 +1354,8 @@
       <w:r>
         <w:rPr>
           <w:rFonts w:ascii="Arial" w:hAnsi="Arial" w:cs="Arial"/>
-          <w:b/>
-          <w:bCs/>
-          <w:sz w:val="26"/>
-          <w:szCs w:val="26"/>
-          <w:u w:val="single"/>
+          <w:sz w:val="26"/>
+          <w:szCs w:val="26"/>
           <w:lang w:bidi="he-IL"/>
         </w:rPr>
         <w:t>photo_pages</w:t>
@@ -1361,11 +1364,8 @@
       <w:r>
         <w:rPr>
           <w:rFonts w:ascii="Arial" w:hAnsi="Arial" w:cs="Arial"/>
-          <w:b/>
-          <w:bCs/>
-          <w:sz w:val="26"/>
-          <w:szCs w:val="26"/>
-          <w:u w:val="single"/>
+          <w:sz w:val="26"/>
+          <w:szCs w:val="26"/>
           <w:rtl/>
           <w:lang w:bidi="he-IL"/>
         </w:rPr>
@@ -1378,15 +1378,60 @@
         <w:jc w:val="center"/>
         <w:rPr>
           <w:rFonts w:ascii="Arial" w:hAnsi="Arial" w:cs="Arial"/>
-          <w:b/>
-          <w:bCs/>
-          <w:sz w:val="26"/>
-          <w:szCs w:val="26"/>
-          <w:u w:val="single"/>
-          <w:rtl/>
-          <w:lang w:bidi="he-IL"/>
-        </w:rPr>
-      </w:pPr>
+          <w:sz w:val="26"/>
+          <w:szCs w:val="26"/>
+          <w:lang w:bidi="he-IL"/>
+        </w:rPr>
+      </w:pPr>
+      <w:r>
+        <w:rPr>
+          <w:rFonts w:ascii="Arial" w:hAnsi="Arial" w:cs="Arial"/>
+          <w:sz w:val="26"/>
+          <w:szCs w:val="26"/>
+          <w:rtl/>
+          <w:lang w:bidi="he-IL"/>
+        </w:rPr>
+        <w:t xml:space="preserve">{% </w:t>
+      </w:r>
+      <w:r>
+        <w:rPr>
+          <w:rFonts w:ascii="Arial" w:hAnsi="Arial" w:cs="Arial"/>
+          <w:sz w:val="26"/>
+          <w:szCs w:val="26"/>
+          <w:lang w:bidi="he-IL"/>
+        </w:rPr>
+        <w:t xml:space="preserve">if </w:t>
+      </w:r>
+      <w:proofErr w:type="spellStart"/>
+      <w:r>
+        <w:rPr>
+          <w:rFonts w:ascii="Arial" w:hAnsi="Arial" w:cs="Arial"/>
+          <w:sz w:val="26"/>
+          <w:szCs w:val="26"/>
+          <w:lang w:bidi="he-IL"/>
+        </w:rPr>
+        <w:t>page.layout</w:t>
+      </w:r>
+      <w:proofErr w:type="spellEnd"/>
+      <w:r>
+        <w:rPr>
+          <w:rFonts w:ascii="Arial" w:hAnsi="Arial" w:cs="Arial"/>
+          <w:sz w:val="26"/>
+          <w:szCs w:val="26"/>
+          <w:lang w:bidi="he-IL"/>
+        </w:rPr>
+        <w:t xml:space="preserve"> == 'row</w:t>
+      </w:r>
+      <w:r>
+        <w:rPr>
+          <w:rFonts w:ascii="Arial" w:hAnsi="Arial" w:cs="Arial"/>
+          <w:sz w:val="26"/>
+          <w:szCs w:val="26"/>
+          <w:rtl/>
+          <w:lang w:bidi="he-IL"/>
+        </w:rPr>
+        <w:t>' %}</w:t>
+      </w:r>
     </w:p>
     <w:p>
       <w:pPr>
@@ -1394,77 +1439,194 @@
         <w:jc w:val="center"/>
         <w:rPr>
           <w:rFonts w:ascii="Arial" w:hAnsi="Arial" w:cs="Arial"/>
-          <w:b/>
-          <w:bCs/>
-          <w:sz w:val="26"/>
-          <w:szCs w:val="26"/>
-          <w:u w:val="single"/>
-          <w:lang w:bidi="he-IL"/>
-        </w:rPr>
-      </w:pPr>
-      <w:r>
-        <w:rPr>
-          <w:rFonts w:ascii="Arial" w:hAnsi="Arial" w:cs="Arial"/>
-          <w:b/>
-          <w:bCs/>
-          <w:sz w:val="26"/>
-          <w:szCs w:val="26"/>
-          <w:u w:val="single"/>
-          <w:rtl/>
-          <w:lang w:bidi="he-IL"/>
-        </w:rPr>
-        <w:t xml:space="preserve">{% </w:t>
-      </w:r>
-      <w:r>
-        <w:rPr>
-          <w:rFonts w:ascii="Arial" w:hAnsi="Arial" w:cs="Arial"/>
-          <w:b/>
-          <w:bCs/>
-          <w:sz w:val="26"/>
-          <w:szCs w:val="26"/>
-          <w:u w:val="single"/>
-          <w:lang w:bidi="he-IL"/>
-        </w:rPr>
-        <w:t xml:space="preserve">if </w:t>
+          <w:sz w:val="26"/>
+          <w:szCs w:val="26"/>
+          <w:lang w:bidi="he-IL"/>
+        </w:rPr>
+      </w:pPr>
+      <w:proofErr w:type="gramStart"/>
+      <w:r>
+        <w:rPr>
+          <w:rFonts w:ascii="Arial" w:hAnsi="Arial" w:cs="Arial"/>
+          <w:sz w:val="26"/>
+          <w:szCs w:val="26"/>
+          <w:lang w:bidi="he-IL"/>
+        </w:rPr>
+        <w:t xml:space="preserve">{{ </w:t>
       </w:r>
       <w:proofErr w:type="spellStart"/>
       <w:r>
         <w:rPr>
           <w:rFonts w:ascii="Arial" w:hAnsi="Arial" w:cs="Arial"/>
-          <w:b/>
-          <w:bCs/>
-          <w:sz w:val="26"/>
-          <w:szCs w:val="26"/>
-          <w:u w:val="single"/>
-          <w:lang w:bidi="he-IL"/>
-        </w:rPr>
-        <w:t>page.layout</w:t>
+          <w:sz w:val="26"/>
+          <w:szCs w:val="26"/>
+          <w:lang w:bidi="he-IL"/>
+        </w:rPr>
+        <w:t>page</w:t>
+      </w:r>
+      <w:proofErr w:type="gramEnd"/>
+      <w:r>
+        <w:rPr>
+          <w:rFonts w:ascii="Arial" w:hAnsi="Arial" w:cs="Arial"/>
+          <w:sz w:val="26"/>
+          <w:szCs w:val="26"/>
+          <w:lang w:bidi="he-IL"/>
+        </w:rPr>
+        <w:t>.</w:t>
+      </w:r>
+      <w:proofErr w:type="gramStart"/>
+      <w:r>
+        <w:rPr>
+          <w:rFonts w:ascii="Arial" w:hAnsi="Arial" w:cs="Arial"/>
+          <w:sz w:val="26"/>
+          <w:szCs w:val="26"/>
+          <w:lang w:bidi="he-IL"/>
+        </w:rPr>
+        <w:t>photos</w:t>
       </w:r>
       <w:proofErr w:type="spellEnd"/>
       <w:r>
         <w:rPr>
           <w:rFonts w:ascii="Arial" w:hAnsi="Arial" w:cs="Arial"/>
-          <w:b/>
-          <w:bCs/>
-          <w:sz w:val="26"/>
-          <w:szCs w:val="26"/>
-          <w:u w:val="single"/>
-          <w:lang w:bidi="he-IL"/>
-        </w:rPr>
-        <w:t xml:space="preserve"> == 'row</w:t>
-      </w:r>
-      <w:r>
-        <w:rPr>
-          <w:rFonts w:ascii="Arial" w:hAnsi="Arial" w:cs="Arial"/>
-          <w:b/>
-          <w:bCs/>
-          <w:sz w:val="26"/>
-          <w:szCs w:val="26"/>
-          <w:u w:val="single"/>
-          <w:rtl/>
-          <w:lang w:bidi="he-IL"/>
-        </w:rPr>
-        <w:t>' %}</w:t>
+          <w:sz w:val="26"/>
+          <w:szCs w:val="26"/>
+          <w:rtl/>
+          <w:lang w:bidi="he-IL"/>
+        </w:rPr>
+        <w:t>[</w:t>
+      </w:r>
+      <w:proofErr w:type="gramEnd"/>
+      <w:r>
+        <w:rPr>
+          <w:rFonts w:ascii="Arial" w:hAnsi="Arial" w:cs="Arial"/>
+          <w:sz w:val="26"/>
+          <w:szCs w:val="26"/>
+          <w:rtl/>
+          <w:lang w:bidi="he-IL"/>
+        </w:rPr>
+        <w:t>0</w:t>
+      </w:r>
+      <w:proofErr w:type="gramStart"/>
+      <w:r>
+        <w:rPr>
+          <w:rFonts w:ascii="Arial" w:hAnsi="Arial" w:cs="Arial"/>
+          <w:sz w:val="26"/>
+          <w:szCs w:val="26"/>
+          <w:rtl/>
+          <w:lang w:bidi="he-IL"/>
+        </w:rPr>
+        <w:t xml:space="preserve">] </w:t>
+      </w:r>
+      <w:r>
+        <w:rPr>
+          <w:rFonts w:ascii="Arial" w:hAnsi="Arial" w:cs="Arial"/>
+          <w:sz w:val="26"/>
+          <w:szCs w:val="26"/>
+          <w:lang w:bidi="he-IL"/>
+        </w:rPr>
+        <w:t>}</w:t>
+      </w:r>
+      <w:proofErr w:type="gramEnd"/>
+      <w:r>
+        <w:rPr>
+          <w:rFonts w:ascii="Arial" w:hAnsi="Arial" w:cs="Arial"/>
+          <w:sz w:val="26"/>
+          <w:szCs w:val="26"/>
+          <w:lang w:bidi="he-IL"/>
+        </w:rPr>
+        <w:t xml:space="preserve">} </w:t>
+      </w:r>
+      <w:proofErr w:type="gramStart"/>
+      <w:r>
+        <w:rPr>
+          <w:rFonts w:ascii="Arial" w:hAnsi="Arial" w:cs="Arial"/>
+          <w:sz w:val="26"/>
+          <w:szCs w:val="26"/>
+          <w:lang w:bidi="he-IL"/>
+        </w:rPr>
+        <w:t xml:space="preserve">{{ </w:t>
+      </w:r>
+      <w:proofErr w:type="spellStart"/>
+      <w:r>
+        <w:rPr>
+          <w:rFonts w:ascii="Arial" w:hAnsi="Arial" w:cs="Arial"/>
+          <w:sz w:val="26"/>
+          <w:szCs w:val="26"/>
+          <w:lang w:bidi="he-IL"/>
+        </w:rPr>
+        <w:t>page</w:t>
+      </w:r>
+      <w:proofErr w:type="gramEnd"/>
+      <w:r>
+        <w:rPr>
+          <w:rFonts w:ascii="Arial" w:hAnsi="Arial" w:cs="Arial"/>
+          <w:sz w:val="26"/>
+          <w:szCs w:val="26"/>
+          <w:lang w:bidi="he-IL"/>
+        </w:rPr>
+        <w:t>.</w:t>
+      </w:r>
+      <w:proofErr w:type="gramStart"/>
+      <w:r>
+        <w:rPr>
+          <w:rFonts w:ascii="Arial" w:hAnsi="Arial" w:cs="Arial"/>
+          <w:sz w:val="26"/>
+          <w:szCs w:val="26"/>
+          <w:lang w:bidi="he-IL"/>
+        </w:rPr>
+        <w:t>photos</w:t>
+      </w:r>
+      <w:proofErr w:type="spellEnd"/>
+      <w:r>
+        <w:rPr>
+          <w:rFonts w:ascii="Arial" w:hAnsi="Arial" w:cs="Arial"/>
+          <w:sz w:val="26"/>
+          <w:szCs w:val="26"/>
+          <w:rtl/>
+          <w:lang w:bidi="he-IL"/>
+        </w:rPr>
+        <w:t>[</w:t>
+      </w:r>
+      <w:proofErr w:type="gramEnd"/>
+      <w:r>
+        <w:rPr>
+          <w:rFonts w:ascii="Arial" w:hAnsi="Arial" w:cs="Arial"/>
+          <w:sz w:val="26"/>
+          <w:szCs w:val="26"/>
+          <w:rtl/>
+          <w:lang w:bidi="he-IL"/>
+        </w:rPr>
+        <w:t>1</w:t>
+      </w:r>
+      <w:proofErr w:type="gramStart"/>
+      <w:r>
+        <w:rPr>
+          <w:rFonts w:ascii="Arial" w:hAnsi="Arial" w:cs="Arial"/>
+          <w:sz w:val="26"/>
+          <w:szCs w:val="26"/>
+          <w:rtl/>
+          <w:lang w:bidi="he-IL"/>
+        </w:rPr>
+        <w:t xml:space="preserve">] </w:t>
+      </w:r>
+      <w:r>
+        <w:rPr>
+          <w:rFonts w:ascii="Arial" w:hAnsi="Arial" w:cs="Arial"/>
+          <w:sz w:val="26"/>
+          <w:szCs w:val="26"/>
+          <w:lang w:bidi="he-IL"/>
+        </w:rPr>
+        <w:t>}</w:t>
+      </w:r>
+      <w:proofErr w:type="gramEnd"/>
+      <w:r>
+        <w:rPr>
+          <w:rFonts w:ascii="Arial" w:hAnsi="Arial" w:cs="Arial"/>
+          <w:sz w:val="26"/>
+          <w:szCs w:val="26"/>
+          <w:lang w:bidi="he-IL"/>
+        </w:rPr>
+        <w:t>}</w:t>
       </w:r>
     </w:p>
     <w:p>
@@ -1473,103 +1635,70 @@
         <w:jc w:val="center"/>
         <w:rPr>
           <w:rFonts w:ascii="Arial" w:hAnsi="Arial" w:cs="Arial"/>
-          <w:b/>
-          <w:bCs/>
-          <w:sz w:val="26"/>
-          <w:szCs w:val="26"/>
-          <w:u w:val="single"/>
-          <w:lang w:bidi="he-IL"/>
-        </w:rPr>
-      </w:pPr>
-      <w:r>
-        <w:rPr>
-          <w:rFonts w:ascii="Arial" w:hAnsi="Arial" w:cs="Arial"/>
-          <w:b/>
-          <w:bCs/>
-          <w:sz w:val="26"/>
-          <w:szCs w:val="26"/>
-          <w:u w:val="single"/>
-          <w:lang w:bidi="he-IL"/>
-        </w:rPr>
-        <w:t xml:space="preserve">{{ </w:t>
+          <w:sz w:val="26"/>
+          <w:szCs w:val="26"/>
+          <w:lang w:bidi="he-IL"/>
+        </w:rPr>
+      </w:pPr>
+      <w:r>
+        <w:rPr>
+          <w:rFonts w:ascii="Arial" w:hAnsi="Arial" w:cs="Arial"/>
+          <w:sz w:val="26"/>
+          <w:szCs w:val="26"/>
+          <w:rtl/>
+          <w:lang w:bidi="he-IL"/>
+        </w:rPr>
+        <w:t xml:space="preserve">{% </w:t>
       </w:r>
       <w:proofErr w:type="spellStart"/>
       <w:r>
         <w:rPr>
           <w:rFonts w:ascii="Arial" w:hAnsi="Arial" w:cs="Arial"/>
-          <w:b/>
-          <w:bCs/>
-          <w:sz w:val="26"/>
-          <w:szCs w:val="26"/>
-          <w:u w:val="single"/>
-          <w:lang w:bidi="he-IL"/>
-        </w:rPr>
-        <w:t>page.photos</w:t>
+          <w:sz w:val="26"/>
+          <w:szCs w:val="26"/>
+          <w:lang w:bidi="he-IL"/>
+        </w:rPr>
+        <w:t>elif</w:t>
       </w:r>
       <w:proofErr w:type="spellEnd"/>
       <w:r>
         <w:rPr>
           <w:rFonts w:ascii="Arial" w:hAnsi="Arial" w:cs="Arial"/>
-          <w:b/>
-          <w:bCs/>
-          <w:sz w:val="26"/>
-          <w:szCs w:val="26"/>
-          <w:u w:val="single"/>
-          <w:rtl/>
-          <w:lang w:bidi="he-IL"/>
-        </w:rPr>
-        <w:t xml:space="preserve">[0] </w:t>
-      </w:r>
-      <w:r>
-        <w:rPr>
-          <w:rFonts w:ascii="Arial" w:hAnsi="Arial" w:cs="Arial"/>
-          <w:b/>
-          <w:bCs/>
-          <w:sz w:val="26"/>
-          <w:szCs w:val="26"/>
-          <w:u w:val="single"/>
-          <w:lang w:bidi="he-IL"/>
-        </w:rPr>
-        <w:t xml:space="preserve">}} {{ </w:t>
+          <w:sz w:val="26"/>
+          <w:szCs w:val="26"/>
+          <w:lang w:bidi="he-IL"/>
+        </w:rPr>
+        <w:t xml:space="preserve"> </w:t>
       </w:r>
       <w:proofErr w:type="spellStart"/>
       <w:r>
         <w:rPr>
           <w:rFonts w:ascii="Arial" w:hAnsi="Arial" w:cs="Arial"/>
-          <w:b/>
-          <w:bCs/>
-          <w:sz w:val="26"/>
-          <w:szCs w:val="26"/>
-          <w:u w:val="single"/>
-          <w:lang w:bidi="he-IL"/>
-        </w:rPr>
-        <w:t>page.photos</w:t>
+          <w:sz w:val="26"/>
+          <w:szCs w:val="26"/>
+          <w:lang w:bidi="he-IL"/>
+        </w:rPr>
+        <w:t>page.layout</w:t>
       </w:r>
       <w:proofErr w:type="spellEnd"/>
       <w:r>
         <w:rPr>
           <w:rFonts w:ascii="Arial" w:hAnsi="Arial" w:cs="Arial"/>
-          <w:b/>
-          <w:bCs/>
-          <w:sz w:val="26"/>
-          <w:szCs w:val="26"/>
-          <w:u w:val="single"/>
-          <w:rtl/>
-          <w:lang w:bidi="he-IL"/>
-        </w:rPr>
-        <w:t xml:space="preserve">[1] </w:t>
-      </w:r>
-      <w:r>
-        <w:rPr>
-          <w:rFonts w:ascii="Arial" w:hAnsi="Arial" w:cs="Arial"/>
-          <w:b/>
-          <w:bCs/>
-          <w:sz w:val="26"/>
-          <w:szCs w:val="26"/>
-          <w:u w:val="single"/>
-          <w:lang w:bidi="he-IL"/>
-        </w:rPr>
-        <w:t>}}</w:t>
+          <w:sz w:val="26"/>
+          <w:szCs w:val="26"/>
+          <w:lang w:bidi="he-IL"/>
+        </w:rPr>
+        <w:t xml:space="preserve"> == 'column</w:t>
+      </w:r>
+      <w:r>
+        <w:rPr>
+          <w:rFonts w:ascii="Arial" w:hAnsi="Arial" w:cs="Arial"/>
+          <w:sz w:val="26"/>
+          <w:szCs w:val="26"/>
+          <w:rtl/>
+          <w:lang w:bidi="he-IL"/>
+        </w:rPr>
+        <w:t>' %}</w:t>
       </w:r>
     </w:p>
     <w:p>
@@ -1578,15 +1707,42 @@
         <w:jc w:val="center"/>
         <w:rPr>
           <w:rFonts w:ascii="Arial" w:hAnsi="Arial" w:cs="Arial"/>
-          <w:b/>
-          <w:bCs/>
-          <w:sz w:val="26"/>
-          <w:szCs w:val="26"/>
-          <w:u w:val="single"/>
-          <w:rtl/>
-          <w:lang w:bidi="he-IL"/>
-        </w:rPr>
-      </w:pPr>
+          <w:sz w:val="26"/>
+          <w:szCs w:val="26"/>
+          <w:lang w:bidi="he-IL"/>
+        </w:rPr>
+      </w:pPr>
+      <w:r>
+        <w:rPr>
+          <w:rFonts w:ascii="Arial" w:hAnsi="Arial" w:cs="Arial"/>
+          <w:sz w:val="26"/>
+          <w:szCs w:val="26"/>
+          <w:rtl/>
+          <w:lang w:bidi="he-IL"/>
+        </w:rPr>
+        <w:t xml:space="preserve">{{ </w:t>
+      </w:r>
+      <w:proofErr w:type="spellStart"/>
+      <w:r>
+        <w:rPr>
+          <w:rFonts w:ascii="Arial" w:hAnsi="Arial" w:cs="Arial"/>
+          <w:sz w:val="26"/>
+          <w:szCs w:val="26"/>
+          <w:lang w:bidi="he-IL"/>
+        </w:rPr>
+        <w:t>page.photos</w:t>
+      </w:r>
+      <w:proofErr w:type="spellEnd"/>
+      <w:r>
+        <w:rPr>
+          <w:rFonts w:ascii="Arial" w:hAnsi="Arial" w:cs="Arial"/>
+          <w:sz w:val="26"/>
+          <w:szCs w:val="26"/>
+          <w:rtl/>
+          <w:lang w:bidi="he-IL"/>
+        </w:rPr>
+        <w:t>[0] }}</w:t>
+      </w:r>
     </w:p>
     <w:p>
       <w:pPr>
@@ -1594,91 +1750,41 @@
         <w:jc w:val="center"/>
         <w:rPr>
           <w:rFonts w:ascii="Arial" w:hAnsi="Arial" w:cs="Arial"/>
-          <w:b/>
-          <w:bCs/>
-          <w:sz w:val="26"/>
-          <w:szCs w:val="26"/>
-          <w:u w:val="single"/>
-          <w:lang w:bidi="he-IL"/>
-        </w:rPr>
-      </w:pPr>
-      <w:r>
-        <w:rPr>
-          <w:rFonts w:ascii="Arial" w:hAnsi="Arial" w:cs="Arial"/>
-          <w:b/>
-          <w:bCs/>
-          <w:sz w:val="26"/>
-          <w:szCs w:val="26"/>
-          <w:u w:val="single"/>
-          <w:rtl/>
-          <w:lang w:bidi="he-IL"/>
-        </w:rPr>
-        <w:t xml:space="preserve">{% </w:t>
+          <w:sz w:val="26"/>
+          <w:szCs w:val="26"/>
+          <w:lang w:bidi="he-IL"/>
+        </w:rPr>
+      </w:pPr>
+      <w:r>
+        <w:rPr>
+          <w:rFonts w:ascii="Arial" w:hAnsi="Arial" w:cs="Arial"/>
+          <w:sz w:val="26"/>
+          <w:szCs w:val="26"/>
+          <w:rtl/>
+          <w:lang w:bidi="he-IL"/>
+        </w:rPr>
+        <w:t xml:space="preserve">{{ </w:t>
       </w:r>
       <w:proofErr w:type="spellStart"/>
       <w:r>
         <w:rPr>
           <w:rFonts w:ascii="Arial" w:hAnsi="Arial" w:cs="Arial"/>
-          <w:b/>
-          <w:bCs/>
-          <w:sz w:val="26"/>
-          <w:szCs w:val="26"/>
-          <w:u w:val="single"/>
-          <w:lang w:bidi="he-IL"/>
-        </w:rPr>
-        <w:t>elif</w:t>
+          <w:sz w:val="26"/>
+          <w:szCs w:val="26"/>
+          <w:lang w:bidi="he-IL"/>
+        </w:rPr>
+        <w:t>page.photos</w:t>
       </w:r>
       <w:proofErr w:type="spellEnd"/>
       <w:r>
         <w:rPr>
           <w:rFonts w:ascii="Arial" w:hAnsi="Arial" w:cs="Arial"/>
-          <w:b/>
-          <w:bCs/>
-          <w:sz w:val="26"/>
-          <w:szCs w:val="26"/>
-          <w:u w:val="single"/>
-          <w:lang w:bidi="he-IL"/>
-        </w:rPr>
-        <w:t xml:space="preserve"> </w:t>
-      </w:r>
-      <w:proofErr w:type="spellStart"/>
-      <w:r>
-        <w:rPr>
-          <w:rFonts w:ascii="Arial" w:hAnsi="Arial" w:cs="Arial"/>
-          <w:b/>
-          <w:bCs/>
-          <w:sz w:val="26"/>
-          <w:szCs w:val="26"/>
-          <w:u w:val="single"/>
-          <w:lang w:bidi="he-IL"/>
-        </w:rPr>
-        <w:t>page.layout</w:t>
-      </w:r>
-      <w:proofErr w:type="spellEnd"/>
-      <w:r>
-        <w:rPr>
-          <w:rFonts w:ascii="Arial" w:hAnsi="Arial" w:cs="Arial"/>
-          <w:b/>
-          <w:bCs/>
-          <w:sz w:val="26"/>
-          <w:szCs w:val="26"/>
-          <w:u w:val="single"/>
-          <w:lang w:bidi="he-IL"/>
-        </w:rPr>
-        <w:t xml:space="preserve"> == 'column</w:t>
-      </w:r>
-      <w:r>
-        <w:rPr>
-          <w:rFonts w:ascii="Arial" w:hAnsi="Arial" w:cs="Arial"/>
-          <w:b/>
-          <w:bCs/>
-          <w:sz w:val="26"/>
-          <w:szCs w:val="26"/>
-          <w:u w:val="single"/>
-          <w:rtl/>
-          <w:lang w:bidi="he-IL"/>
-        </w:rPr>
-        <w:t>' %}</w:t>
+          <w:sz w:val="26"/>
+          <w:szCs w:val="26"/>
+          <w:rtl/>
+          <w:lang w:bidi="he-IL"/>
+        </w:rPr>
+        <w:t>[1] }}</w:t>
       </w:r>
     </w:p>
     <w:p>
@@ -1687,53 +1793,39 @@
         <w:jc w:val="center"/>
         <w:rPr>
           <w:rFonts w:ascii="Arial" w:hAnsi="Arial" w:cs="Arial"/>
-          <w:b/>
-          <w:bCs/>
-          <w:sz w:val="26"/>
-          <w:szCs w:val="26"/>
-          <w:u w:val="single"/>
-          <w:lang w:bidi="he-IL"/>
-        </w:rPr>
-      </w:pPr>
-      <w:r>
-        <w:rPr>
-          <w:rFonts w:ascii="Arial" w:hAnsi="Arial" w:cs="Arial"/>
-          <w:b/>
-          <w:bCs/>
-          <w:sz w:val="26"/>
-          <w:szCs w:val="26"/>
-          <w:u w:val="single"/>
-          <w:rtl/>
-          <w:lang w:bidi="he-IL"/>
-        </w:rPr>
-        <w:t xml:space="preserve">{{ </w:t>
-      </w:r>
-      <w:proofErr w:type="spellStart"/>
-      <w:r>
-        <w:rPr>
-          <w:rFonts w:ascii="Arial" w:hAnsi="Arial" w:cs="Arial"/>
-          <w:b/>
-          <w:bCs/>
-          <w:sz w:val="26"/>
-          <w:szCs w:val="26"/>
-          <w:u w:val="single"/>
-          <w:lang w:bidi="he-IL"/>
-        </w:rPr>
-        <w:t>page.photos</w:t>
-      </w:r>
-      <w:proofErr w:type="spellEnd"/>
-      <w:r>
-        <w:rPr>
-          <w:rFonts w:ascii="Arial" w:hAnsi="Arial" w:cs="Arial"/>
-          <w:b/>
-          <w:bCs/>
-          <w:sz w:val="26"/>
-          <w:szCs w:val="26"/>
-          <w:u w:val="single"/>
-          <w:rtl/>
-          <w:lang w:bidi="he-IL"/>
-        </w:rPr>
-        <w:t>[0] }}</w:t>
+          <w:sz w:val="26"/>
+          <w:szCs w:val="26"/>
+          <w:lang w:bidi="he-IL"/>
+        </w:rPr>
+      </w:pPr>
+      <w:r>
+        <w:rPr>
+          <w:rFonts w:ascii="Arial" w:hAnsi="Arial" w:cs="Arial"/>
+          <w:sz w:val="26"/>
+          <w:szCs w:val="26"/>
+          <w:rtl/>
+          <w:lang w:bidi="he-IL"/>
+        </w:rPr>
+        <w:t xml:space="preserve">{% </w:t>
+      </w:r>
+      <w:r>
+        <w:rPr>
+          <w:rFonts w:ascii="Arial" w:hAnsi="Arial" w:cs="Arial"/>
+          <w:sz w:val="26"/>
+          <w:szCs w:val="26"/>
+          <w:lang w:bidi="he-IL"/>
+        </w:rPr>
+        <w:t>else</w:t>
+      </w:r>
+      <w:r>
+        <w:rPr>
+          <w:rFonts w:ascii="Arial" w:hAnsi="Arial" w:cs="Arial"/>
+          <w:sz w:val="26"/>
+          <w:szCs w:val="26"/>
+          <w:rtl/>
+          <w:lang w:bidi="he-IL"/>
+        </w:rPr>
+        <w:t xml:space="preserve"> %}</w:t>
       </w:r>
     </w:p>
     <w:p>
@@ -1742,15 +1834,42 @@
         <w:jc w:val="center"/>
         <w:rPr>
           <w:rFonts w:ascii="Arial" w:hAnsi="Arial" w:cs="Arial"/>
-          <w:b/>
-          <w:bCs/>
-          <w:sz w:val="26"/>
-          <w:szCs w:val="26"/>
-          <w:u w:val="single"/>
-          <w:rtl/>
-          <w:lang w:bidi="he-IL"/>
-        </w:rPr>
-      </w:pPr>
+          <w:sz w:val="26"/>
+          <w:szCs w:val="26"/>
+          <w:lang w:bidi="he-IL"/>
+        </w:rPr>
+      </w:pPr>
+      <w:r>
+        <w:rPr>
+          <w:rFonts w:ascii="Arial" w:hAnsi="Arial" w:cs="Arial"/>
+          <w:sz w:val="26"/>
+          <w:szCs w:val="26"/>
+          <w:rtl/>
+          <w:lang w:bidi="he-IL"/>
+        </w:rPr>
+        <w:t xml:space="preserve">{{ </w:t>
+      </w:r>
+      <w:proofErr w:type="spellStart"/>
+      <w:r>
+        <w:rPr>
+          <w:rFonts w:ascii="Arial" w:hAnsi="Arial" w:cs="Arial"/>
+          <w:sz w:val="26"/>
+          <w:szCs w:val="26"/>
+          <w:lang w:bidi="he-IL"/>
+        </w:rPr>
+        <w:t>page.photos</w:t>
+      </w:r>
+      <w:proofErr w:type="spellEnd"/>
+      <w:r>
+        <w:rPr>
+          <w:rFonts w:ascii="Arial" w:hAnsi="Arial" w:cs="Arial"/>
+          <w:sz w:val="26"/>
+          <w:szCs w:val="26"/>
+          <w:rtl/>
+          <w:lang w:bidi="he-IL"/>
+        </w:rPr>
+        <w:t>[0] }}</w:t>
+      </w:r>
     </w:p>
     <w:p>
       <w:pPr>
@@ -1758,53 +1877,39 @@
         <w:jc w:val="center"/>
         <w:rPr>
           <w:rFonts w:ascii="Arial" w:hAnsi="Arial" w:cs="Arial"/>
-          <w:b/>
-          <w:bCs/>
-          <w:sz w:val="26"/>
-          <w:szCs w:val="26"/>
-          <w:u w:val="single"/>
-          <w:lang w:bidi="he-IL"/>
-        </w:rPr>
-      </w:pPr>
-      <w:r>
-        <w:rPr>
-          <w:rFonts w:ascii="Arial" w:hAnsi="Arial" w:cs="Arial"/>
-          <w:b/>
-          <w:bCs/>
-          <w:sz w:val="26"/>
-          <w:szCs w:val="26"/>
-          <w:u w:val="single"/>
-          <w:rtl/>
-          <w:lang w:bidi="he-IL"/>
-        </w:rPr>
-        <w:t xml:space="preserve">{{ </w:t>
-      </w:r>
-      <w:proofErr w:type="spellStart"/>
-      <w:r>
-        <w:rPr>
-          <w:rFonts w:ascii="Arial" w:hAnsi="Arial" w:cs="Arial"/>
-          <w:b/>
-          <w:bCs/>
-          <w:sz w:val="26"/>
-          <w:szCs w:val="26"/>
-          <w:u w:val="single"/>
-          <w:lang w:bidi="he-IL"/>
-        </w:rPr>
-        <w:t>page.photos</w:t>
-      </w:r>
-      <w:proofErr w:type="spellEnd"/>
-      <w:r>
-        <w:rPr>
-          <w:rFonts w:ascii="Arial" w:hAnsi="Arial" w:cs="Arial"/>
-          <w:b/>
-          <w:bCs/>
-          <w:sz w:val="26"/>
-          <w:szCs w:val="26"/>
-          <w:u w:val="single"/>
-          <w:rtl/>
-          <w:lang w:bidi="he-IL"/>
-        </w:rPr>
-        <w:t>[1] }}</w:t>
+          <w:sz w:val="26"/>
+          <w:szCs w:val="26"/>
+          <w:lang w:bidi="he-IL"/>
+        </w:rPr>
+      </w:pPr>
+      <w:r>
+        <w:rPr>
+          <w:rFonts w:ascii="Arial" w:hAnsi="Arial" w:cs="Arial"/>
+          <w:sz w:val="26"/>
+          <w:szCs w:val="26"/>
+          <w:rtl/>
+          <w:lang w:bidi="he-IL"/>
+        </w:rPr>
+        <w:t xml:space="preserve">{% </w:t>
+      </w:r>
+      <w:r>
+        <w:rPr>
+          <w:rFonts w:ascii="Arial" w:hAnsi="Arial" w:cs="Arial"/>
+          <w:sz w:val="26"/>
+          <w:szCs w:val="26"/>
+          <w:lang w:bidi="he-IL"/>
+        </w:rPr>
+        <w:t>endif</w:t>
+      </w:r>
+      <w:r>
+        <w:rPr>
+          <w:rFonts w:ascii="Arial" w:hAnsi="Arial" w:cs="Arial"/>
+          <w:sz w:val="26"/>
+          <w:szCs w:val="26"/>
+          <w:rtl/>
+          <w:lang w:bidi="he-IL"/>
+        </w:rPr>
+        <w:t xml:space="preserve"> %}</w:t>
       </w:r>
     </w:p>
     <w:p>
@@ -1813,19 +1918,46 @@
         <w:jc w:val="center"/>
         <w:rPr>
           <w:rFonts w:ascii="Arial" w:hAnsi="Arial" w:cs="Arial"/>
-          <w:b/>
-          <w:bCs/>
-          <w:sz w:val="26"/>
-          <w:szCs w:val="26"/>
-          <w:u w:val="single"/>
-          <w:rtl/>
-          <w:lang w:bidi="he-IL"/>
-        </w:rPr>
-      </w:pPr>
+          <w:sz w:val="26"/>
+          <w:szCs w:val="26"/>
+          <w:rtl/>
+          <w:lang w:bidi="he-IL"/>
+        </w:rPr>
+      </w:pPr>
+      <w:r>
+        <w:rPr>
+          <w:rFonts w:ascii="Arial" w:hAnsi="Arial" w:cs="Arial"/>
+          <w:sz w:val="26"/>
+          <w:szCs w:val="26"/>
+          <w:rtl/>
+          <w:lang w:bidi="he-IL"/>
+        </w:rPr>
+        <w:t xml:space="preserve">{% </w:t>
+      </w:r>
+      <w:proofErr w:type="spellStart"/>
+      <w:r>
+        <w:rPr>
+          <w:rFonts w:ascii="Arial" w:hAnsi="Arial" w:cs="Arial"/>
+          <w:sz w:val="26"/>
+          <w:szCs w:val="26"/>
+          <w:lang w:bidi="he-IL"/>
+        </w:rPr>
+        <w:t>endfor</w:t>
+      </w:r>
+      <w:proofErr w:type="spellEnd"/>
+      <w:r>
+        <w:rPr>
+          <w:rFonts w:ascii="Arial" w:hAnsi="Arial" w:cs="Arial"/>
+          <w:sz w:val="26"/>
+          <w:szCs w:val="26"/>
+          <w:rtl/>
+          <w:lang w:bidi="he-IL"/>
+        </w:rPr>
+        <w:t xml:space="preserve"> %}</w:t>
+      </w:r>
     </w:p>
     <w:p>
       <w:pPr>
-        <w:spacing w:line="360" w:lineRule="auto"/>
         <w:jc w:val="center"/>
         <w:rPr>
           <w:rFonts w:ascii="Arial" w:hAnsi="Arial" w:cs="Arial"/>
@@ -1833,308 +1965,20 @@
           <w:bCs/>
           <w:sz w:val="26"/>
           <w:szCs w:val="26"/>
-          <w:u w:val="single"/>
-          <w:lang w:bidi="he-IL"/>
-        </w:rPr>
-      </w:pPr>
-      <w:r>
-        <w:rPr>
-          <w:rFonts w:ascii="Arial" w:hAnsi="Arial" w:cs="Arial"/>
-          <w:b/>
-          <w:bCs/>
-          <w:sz w:val="26"/>
-          <w:szCs w:val="26"/>
-          <w:u w:val="single"/>
-          <w:rtl/>
-          <w:lang w:bidi="he-IL"/>
+          <w:rtl/>
+          <w:lang w:bidi="he-IL"/>
+        </w:rPr>
+      </w:pPr>
+      <w:r>
+        <w:rPr>
+          <w:rFonts w:ascii="Arial" w:hAnsi="Arial" w:cs="Arial" w:hint="cs"/>
+          <w:b/>
+          <w:bCs/>
+          <w:sz w:val="26"/>
+          <w:szCs w:val="26"/>
+          <w:rtl/>
         </w:rPr>
         <w:lastRenderedPageBreak/>
-        <w:t xml:space="preserve">{% </w:t>
-      </w:r>
-      <w:r>
-        <w:rPr>
-          <w:rFonts w:ascii="Arial" w:hAnsi="Arial" w:cs="Arial"/>
-          <w:b/>
-          <w:bCs/>
-          <w:sz w:val="26"/>
-          <w:szCs w:val="26"/>
-          <w:u w:val="single"/>
-          <w:lang w:bidi="he-IL"/>
-        </w:rPr>
-        <w:t>else</w:t>
-      </w:r>
-      <w:r>
-        <w:rPr>
-          <w:rFonts w:ascii="Arial" w:hAnsi="Arial" w:cs="Arial"/>
-          <w:b/>
-          <w:bCs/>
-          <w:sz w:val="26"/>
-          <w:szCs w:val="26"/>
-          <w:u w:val="single"/>
-          <w:rtl/>
-          <w:lang w:bidi="he-IL"/>
-        </w:rPr>
-        <w:t xml:space="preserve"> %}</w:t>
-      </w:r>
-    </w:p>
-    <w:p>
-      <w:pPr>
-        <w:spacing w:line="360" w:lineRule="auto"/>
-        <w:jc w:val="center"/>
-        <w:rPr>
-          <w:rFonts w:ascii="Arial" w:hAnsi="Arial" w:cs="Arial"/>
-          <w:b/>
-          <w:bCs/>
-          <w:sz w:val="26"/>
-          <w:szCs w:val="26"/>
-          <w:u w:val="single"/>
-          <w:lang w:bidi="he-IL"/>
-        </w:rPr>
-      </w:pPr>
-      <w:r>
-        <w:rPr>
-          <w:rFonts w:ascii="Arial" w:hAnsi="Arial" w:cs="Arial"/>
-          <w:b/>
-          <w:bCs/>
-          <w:sz w:val="26"/>
-          <w:szCs w:val="26"/>
-          <w:u w:val="single"/>
-          <w:rtl/>
-          <w:lang w:bidi="he-IL"/>
-        </w:rPr>
-        <w:t xml:space="preserve">{{ </w:t>
-      </w:r>
-      <w:proofErr w:type="spellStart"/>
-      <w:r>
-        <w:rPr>
-          <w:rFonts w:ascii="Arial" w:hAnsi="Arial" w:cs="Arial"/>
-          <w:b/>
-          <w:bCs/>
-          <w:sz w:val="26"/>
-          <w:szCs w:val="26"/>
-          <w:u w:val="single"/>
-          <w:lang w:bidi="he-IL"/>
-        </w:rPr>
-        <w:t>page.photos</w:t>
-      </w:r>
-      <w:proofErr w:type="spellEnd"/>
-      <w:r>
-        <w:rPr>
-          <w:rFonts w:ascii="Arial" w:hAnsi="Arial" w:cs="Arial"/>
-          <w:b/>
-          <w:bCs/>
-          <w:sz w:val="26"/>
-          <w:szCs w:val="26"/>
-          <w:u w:val="single"/>
-          <w:rtl/>
-          <w:lang w:bidi="he-IL"/>
-        </w:rPr>
-        <w:t>[0] }}</w:t>
-      </w:r>
-    </w:p>
-    <w:p>
-      <w:pPr>
-        <w:spacing w:line="360" w:lineRule="auto"/>
-        <w:jc w:val="center"/>
-        <w:rPr>
-          <w:rFonts w:ascii="Arial" w:hAnsi="Arial" w:cs="Arial"/>
-          <w:b/>
-          <w:bCs/>
-          <w:sz w:val="26"/>
-          <w:szCs w:val="26"/>
-          <w:u w:val="single"/>
-          <w:lang w:bidi="he-IL"/>
-        </w:rPr>
-      </w:pPr>
-      <w:r>
-        <w:rPr>
-          <w:rFonts w:ascii="Arial" w:hAnsi="Arial" w:cs="Arial"/>
-          <w:b/>
-          <w:bCs/>
-          <w:sz w:val="26"/>
-          <w:szCs w:val="26"/>
-          <w:u w:val="single"/>
-          <w:rtl/>
-          <w:lang w:bidi="he-IL"/>
-        </w:rPr>
-        <w:t xml:space="preserve">{% </w:t>
-      </w:r>
-      <w:r>
-        <w:rPr>
-          <w:rFonts w:ascii="Arial" w:hAnsi="Arial" w:cs="Arial"/>
-          <w:b/>
-          <w:bCs/>
-          <w:sz w:val="26"/>
-          <w:szCs w:val="26"/>
-          <w:u w:val="single"/>
-          <w:lang w:bidi="he-IL"/>
-        </w:rPr>
-        <w:t>endif</w:t>
-      </w:r>
-      <w:r>
-        <w:rPr>
-          <w:rFonts w:ascii="Arial" w:hAnsi="Arial" w:cs="Arial"/>
-          <w:b/>
-          <w:bCs/>
-          <w:sz w:val="26"/>
-          <w:szCs w:val="26"/>
-          <w:u w:val="single"/>
-          <w:rtl/>
-          <w:lang w:bidi="he-IL"/>
-        </w:rPr>
-        <w:t xml:space="preserve"> %}</w:t>
-      </w:r>
-    </w:p>
-    <w:p>
-      <w:pPr>
-        <w:spacing w:line="360" w:lineRule="auto"/>
-        <w:jc w:val="center"/>
-        <w:rPr>
-          <w:rFonts w:ascii="Arial" w:hAnsi="Arial" w:cs="Arial"/>
-          <w:b/>
-          <w:bCs/>
-          <w:sz w:val="26"/>
-          <w:szCs w:val="26"/>
-          <w:u w:val="single"/>
-          <w:rtl/>
-          <w:lang w:bidi="he-IL"/>
-        </w:rPr>
-      </w:pPr>
-    </w:p>
-    <w:p>
-      <w:pPr>
-        <w:spacing w:line="360" w:lineRule="auto"/>
-        <w:jc w:val="center"/>
-        <w:rPr>
-          <w:rFonts w:ascii="Arial" w:hAnsi="Arial" w:cs="Arial"/>
-          <w:b/>
-          <w:bCs/>
-          <w:sz w:val="26"/>
-          <w:szCs w:val="26"/>
-          <w:u w:val="single"/>
-          <w:rtl/>
-          <w:lang w:bidi="he-IL"/>
-        </w:rPr>
-      </w:pPr>
-      <w:r>
-        <w:rPr>
-          <w:rFonts w:ascii="Arial" w:hAnsi="Arial" w:cs="Arial"/>
-          <w:b/>
-          <w:bCs/>
-          <w:sz w:val="26"/>
-          <w:szCs w:val="26"/>
-          <w:u w:val="single"/>
-          <w:rtl/>
-          <w:lang w:bidi="he-IL"/>
-        </w:rPr>
-        <w:t xml:space="preserve">{% </w:t>
-      </w:r>
-      <w:proofErr w:type="spellStart"/>
-      <w:r>
-        <w:rPr>
-          <w:rFonts w:ascii="Arial" w:hAnsi="Arial" w:cs="Arial"/>
-          <w:b/>
-          <w:bCs/>
-          <w:sz w:val="26"/>
-          <w:szCs w:val="26"/>
-          <w:u w:val="single"/>
-          <w:lang w:bidi="he-IL"/>
-        </w:rPr>
-        <w:t>endfor</w:t>
-      </w:r>
-      <w:proofErr w:type="spellEnd"/>
-      <w:r>
-        <w:rPr>
-          <w:rFonts w:ascii="Arial" w:hAnsi="Arial" w:cs="Arial"/>
-          <w:b/>
-          <w:bCs/>
-          <w:sz w:val="26"/>
-          <w:szCs w:val="26"/>
-          <w:u w:val="single"/>
-          <w:rtl/>
-          <w:lang w:bidi="he-IL"/>
-        </w:rPr>
-        <w:t xml:space="preserve"> %}</w:t>
-      </w:r>
-    </w:p>
-    <w:p>
-      <w:pPr>
-        <w:rPr>
-          <w:rFonts w:ascii="Arial" w:hAnsi="Arial" w:cs="Arial"/>
-          <w:b/>
-          <w:bCs/>
-          <w:sz w:val="26"/>
-          <w:szCs w:val="26"/>
-          <w:u w:val="single"/>
-          <w:rtl/>
-          <w:lang w:val="en-ZA" w:bidi="he-IL"/>
-        </w:rPr>
-      </w:pPr>
-    </w:p>
-    <w:p>
-      <w:pPr>
-        <w:pStyle w:val="NoSpacing"/>
-        <w:spacing w:line="360" w:lineRule="auto"/>
-        <w:ind w:left="1440" w:hanging="1440"/>
-        <w:rPr>
-          <w:rFonts w:asciiTheme="minorBidi" w:hAnsiTheme="minorBidi"/>
-          <w:sz w:val="26"/>
-          <w:szCs w:val="26"/>
-          <w:rtl/>
-        </w:rPr>
-      </w:pPr>
-      <w:bookmarkStart w:id="1" w:name="_Hlk198631539"/>
-    </w:p>
-    <w:p>
-      <w:pPr>
-        <w:pStyle w:val="NoSpacing"/>
-        <w:spacing w:line="360" w:lineRule="auto"/>
-        <w:ind w:left="1440" w:hanging="1440"/>
-        <w:rPr>
-          <w:rFonts w:asciiTheme="minorBidi" w:hAnsiTheme="minorBidi"/>
-          <w:sz w:val="26"/>
-          <w:szCs w:val="26"/>
-          <w:rtl/>
-        </w:rPr>
-      </w:pPr>
-    </w:p>
-    <w:bookmarkEnd w:id="1"/>
-    <w:p>
-      <w:pPr>
-        <w:jc w:val="center"/>
-        <w:rPr>
-          <w:rFonts w:ascii="Arial" w:hAnsi="Arial" w:cs="Arial"/>
-          <w:b/>
-          <w:bCs/>
-          <w:sz w:val="26"/>
-          <w:szCs w:val="26"/>
-          <w:rtl/>
-          <w:lang w:bidi="he-IL"/>
-        </w:rPr>
-      </w:pPr>
-    </w:p>
-    <w:p>
-      <w:pPr>
-        <w:jc w:val="center"/>
-        <w:rPr>
-          <w:rFonts w:ascii="Arial" w:hAnsi="Arial" w:cs="Arial"/>
-          <w:b/>
-          <w:bCs/>
-          <w:sz w:val="26"/>
-          <w:szCs w:val="26"/>
-          <w:rtl/>
-          <w:lang w:bidi="he-IL"/>
-        </w:rPr>
-      </w:pPr>
-      <w:r>
-        <w:rPr>
-          <w:rFonts w:ascii="Arial" w:hAnsi="Arial" w:cs="Arial" w:hint="cs"/>
-          <w:b/>
-          <w:bCs/>
-          <w:sz w:val="26"/>
-          <w:szCs w:val="26"/>
-          <w:rtl/>
-        </w:rPr>
         <w:t>בברכה,</w:t>
       </w:r>
       <w:r>

</xml_diff>